<commit_message>
Add official ANITS emblem logo to Cover page and Bonafide Certificate
</commit_message>
<xml_diff>
--- a/IBMQ2DST2470_Internship_Case_Study_Report.docx
+++ b/IBMQ2DST2470_Internship_Case_Study_Report.docx
@@ -65,7 +65,7 @@
     </w:p>
     <w:p>
       <w:pPr>
-        <w:spacing w:after="800"/>
+        <w:spacing w:after="300"/>
         <w:jc w:val="center"/>
       </w:pPr>
       <w:r>
@@ -79,7 +79,47 @@
     </w:p>
     <w:p>
       <w:pPr>
-        <w:spacing w:before="600" w:after="80"/>
+        <w:spacing w:before="200" w:after="300"/>
+        <w:jc w:val="center"/>
+      </w:pPr>
+      <w:r>
+        <w:drawing>
+          <wp:inline xmlns:a="http://schemas.openxmlformats.org/drawingml/2006/main" xmlns:pic="http://schemas.openxmlformats.org/drawingml/2006/picture">
+            <wp:extent cx="1554480" cy="1551371"/>
+            <wp:docPr id="1" name="Picture 1"/>
+            <wp:cNvGraphicFramePr>
+              <a:graphicFrameLocks noChangeAspect="1"/>
+            </wp:cNvGraphicFramePr>
+            <a:graphic>
+              <a:graphicData uri="http://schemas.openxmlformats.org/drawingml/2006/picture">
+                <pic:pic>
+                  <pic:nvPicPr>
+                    <pic:cNvPr id="0" name="anits_logo_colored.png"/>
+                    <pic:cNvPicPr/>
+                  </pic:nvPicPr>
+                  <pic:blipFill>
+                    <a:blip r:embed="rId9"/>
+                    <a:stretch>
+                      <a:fillRect/>
+                    </a:stretch>
+                  </pic:blipFill>
+                  <pic:spPr>
+                    <a:xfrm>
+                      <a:off x="0" y="0"/>
+                      <a:ext cx="1554480" cy="1551371"/>
+                    </a:xfrm>
+                    <a:prstGeom prst="rect"/>
+                  </pic:spPr>
+                </pic:pic>
+              </a:graphicData>
+            </a:graphic>
+          </wp:inline>
+        </w:drawing>
+      </w:r>
+    </w:p>
+    <w:p>
+      <w:pPr>
+        <w:spacing w:before="200" w:after="80"/>
         <w:jc w:val="center"/>
       </w:pPr>
       <w:r>
@@ -176,12 +216,51 @@
         </w:rPr>
         <w:t>2024–2028</w:t>
         <w:br/>
-        <w:br/>
       </w:r>
     </w:p>
     <w:p>
       <w:pPr>
-        <w:spacing w:after="480"/>
+        <w:spacing w:before="160" w:after="240"/>
+        <w:jc w:val="center"/>
+      </w:pPr>
+      <w:r>
+        <w:drawing>
+          <wp:inline xmlns:a="http://schemas.openxmlformats.org/drawingml/2006/main" xmlns:pic="http://schemas.openxmlformats.org/drawingml/2006/picture">
+            <wp:extent cx="1371600" cy="1368857"/>
+            <wp:docPr id="2" name="Picture 2"/>
+            <wp:cNvGraphicFramePr>
+              <a:graphicFrameLocks noChangeAspect="1"/>
+            </wp:cNvGraphicFramePr>
+            <a:graphic>
+              <a:graphicData uri="http://schemas.openxmlformats.org/drawingml/2006/picture">
+                <pic:pic>
+                  <pic:nvPicPr>
+                    <pic:cNvPr id="0" name="anits_logo_colored.png"/>
+                    <pic:cNvPicPr/>
+                  </pic:nvPicPr>
+                  <pic:blipFill>
+                    <a:blip r:embed="rId9"/>
+                    <a:stretch>
+                      <a:fillRect/>
+                    </a:stretch>
+                  </pic:blipFill>
+                  <pic:spPr>
+                    <a:xfrm>
+                      <a:off x="0" y="0"/>
+                      <a:ext cx="1371600" cy="1368857"/>
+                    </a:xfrm>
+                    <a:prstGeom prst="rect"/>
+                  </pic:spPr>
+                </pic:pic>
+              </a:graphicData>
+            </a:graphic>
+          </wp:inline>
+        </w:drawing>
+      </w:r>
+    </w:p>
+    <w:p>
+      <w:pPr>
+        <w:spacing w:after="400"/>
         <w:jc w:val="center"/>
       </w:pPr>
       <w:r>
@@ -5046,7 +5125,7 @@
         <w:drawing>
           <wp:inline xmlns:a="http://schemas.openxmlformats.org/drawingml/2006/main" xmlns:pic="http://schemas.openxmlformats.org/drawingml/2006/picture">
             <wp:extent cx="5029200" cy="2743200"/>
-            <wp:docPr id="1" name="Picture 1"/>
+            <wp:docPr id="3" name="Picture 3"/>
             <wp:cNvGraphicFramePr>
               <a:graphicFrameLocks noChangeAspect="1"/>
             </wp:cNvGraphicFramePr>
@@ -5058,7 +5137,7 @@
                     <pic:cNvPicPr/>
                   </pic:nvPicPr>
                   <pic:blipFill>
-                    <a:blip r:embed="rId9"/>
+                    <a:blip r:embed="rId10"/>
                     <a:stretch>
                       <a:fillRect/>
                     </a:stretch>
@@ -5094,7 +5173,7 @@
         <w:drawing>
           <wp:inline xmlns:a="http://schemas.openxmlformats.org/drawingml/2006/main" xmlns:pic="http://schemas.openxmlformats.org/drawingml/2006/picture">
             <wp:extent cx="5029200" cy="1975757"/>
-            <wp:docPr id="2" name="Picture 2"/>
+            <wp:docPr id="4" name="Picture 4"/>
             <wp:cNvGraphicFramePr>
               <a:graphicFrameLocks noChangeAspect="1"/>
             </wp:cNvGraphicFramePr>
@@ -5106,7 +5185,7 @@
                     <pic:cNvPicPr/>
                   </pic:nvPicPr>
                   <pic:blipFill>
-                    <a:blip r:embed="rId10"/>
+                    <a:blip r:embed="rId11"/>
                     <a:stretch>
                       <a:fillRect/>
                     </a:stretch>
@@ -5142,7 +5221,7 @@
         <w:drawing>
           <wp:inline xmlns:a="http://schemas.openxmlformats.org/drawingml/2006/main" xmlns:pic="http://schemas.openxmlformats.org/drawingml/2006/picture">
             <wp:extent cx="5029200" cy="2127738"/>
-            <wp:docPr id="3" name="Picture 3"/>
+            <wp:docPr id="5" name="Picture 5"/>
             <wp:cNvGraphicFramePr>
               <a:graphicFrameLocks noChangeAspect="1"/>
             </wp:cNvGraphicFramePr>
@@ -5154,7 +5233,7 @@
                     <pic:cNvPicPr/>
                   </pic:nvPicPr>
                   <pic:blipFill>
-                    <a:blip r:embed="rId11"/>
+                    <a:blip r:embed="rId12"/>
                     <a:stretch>
                       <a:fillRect/>
                     </a:stretch>
@@ -5206,7 +5285,7 @@
         <w:drawing>
           <wp:inline xmlns:a="http://schemas.openxmlformats.org/drawingml/2006/main" xmlns:pic="http://schemas.openxmlformats.org/drawingml/2006/picture">
             <wp:extent cx="4572000" cy="3143250"/>
-            <wp:docPr id="4" name="Picture 4"/>
+            <wp:docPr id="6" name="Picture 6"/>
             <wp:cNvGraphicFramePr>
               <a:graphicFrameLocks noChangeAspect="1"/>
             </wp:cNvGraphicFramePr>
@@ -5218,7 +5297,7 @@
                     <pic:cNvPicPr/>
                   </pic:nvPicPr>
                   <pic:blipFill>
-                    <a:blip r:embed="rId12"/>
+                    <a:blip r:embed="rId13"/>
                     <a:stretch>
                       <a:fillRect/>
                     </a:stretch>
@@ -5270,7 +5349,7 @@
         <w:drawing>
           <wp:inline xmlns:a="http://schemas.openxmlformats.org/drawingml/2006/main" xmlns:pic="http://schemas.openxmlformats.org/drawingml/2006/picture">
             <wp:extent cx="4572000" cy="4286250"/>
-            <wp:docPr id="5" name="Picture 5"/>
+            <wp:docPr id="7" name="Picture 7"/>
             <wp:cNvGraphicFramePr>
               <a:graphicFrameLocks noChangeAspect="1"/>
             </wp:cNvGraphicFramePr>
@@ -5282,7 +5361,7 @@
                     <pic:cNvPicPr/>
                   </pic:nvPicPr>
                   <pic:blipFill>
-                    <a:blip r:embed="rId13"/>
+                    <a:blip r:embed="rId14"/>
                     <a:stretch>
                       <a:fillRect/>
                     </a:stretch>
@@ -5847,7 +5926,7 @@
         <w:drawing>
           <wp:inline xmlns:a="http://schemas.openxmlformats.org/drawingml/2006/main" xmlns:pic="http://schemas.openxmlformats.org/drawingml/2006/picture">
             <wp:extent cx="4114800" cy="2244436"/>
-            <wp:docPr id="6" name="Picture 6"/>
+            <wp:docPr id="8" name="Picture 8"/>
             <wp:cNvGraphicFramePr>
               <a:graphicFrameLocks noChangeAspect="1"/>
             </wp:cNvGraphicFramePr>
@@ -5859,7 +5938,7 @@
                     <pic:cNvPicPr/>
                   </pic:nvPicPr>
                   <pic:blipFill>
-                    <a:blip r:embed="rId9"/>
+                    <a:blip r:embed="rId10"/>
                     <a:stretch>
                       <a:fillRect/>
                     </a:stretch>
@@ -5883,7 +5962,7 @@
         <w:drawing>
           <wp:inline xmlns:a="http://schemas.openxmlformats.org/drawingml/2006/main" xmlns:pic="http://schemas.openxmlformats.org/drawingml/2006/picture">
             <wp:extent cx="4114800" cy="2828925"/>
-            <wp:docPr id="7" name="Picture 7"/>
+            <wp:docPr id="9" name="Picture 9"/>
             <wp:cNvGraphicFramePr>
               <a:graphicFrameLocks noChangeAspect="1"/>
             </wp:cNvGraphicFramePr>
@@ -5895,7 +5974,7 @@
                     <pic:cNvPicPr/>
                   </pic:nvPicPr>
                   <pic:blipFill>
-                    <a:blip r:embed="rId12"/>
+                    <a:blip r:embed="rId13"/>
                     <a:stretch>
                       <a:fillRect/>
                     </a:stretch>

</xml_diff>

<commit_message>
Add official IBM Q2B Pearl certificate of completion to final page
</commit_message>
<xml_diff>
--- a/IBMQ2DST2470_Internship_Case_Study_Report.docx
+++ b/IBMQ2DST2470_Internship_Case_Study_Report.docx
@@ -5994,6 +5994,11 @@
       </w:r>
     </w:p>
     <w:p>
+      <w:r>
+        <w:br w:type="page"/>
+      </w:r>
+    </w:p>
+    <w:p>
       <w:pPr>
         <w:pStyle w:val="Heading2"/>
       </w:pPr>
@@ -6003,10 +6008,50 @@
     </w:p>
     <w:p>
       <w:pPr>
-        <w:spacing w:line="312" w:lineRule="auto"/>
+        <w:spacing w:line="312" w:lineRule="auto" w:after="240"/>
       </w:pPr>
       <w:r>
-        <w:t>The certificate awarded for successful completion of the IBM Q2B Pearl Internship Program (IBMQ2D Case Study #18, IBM ID: IBMQ2DST2470) will be attached here upon final program issuance.</w:t>
+        <w:t>The certificate awarded for successful completion of the IBM Q2B Pearl Internship Program in Artificial Intelligence &amp; Machine Learning (IBMQ2D Case Study #18, Application No: IBMQ2DST2470) is included below for reference:</w:t>
+      </w:r>
+    </w:p>
+    <w:p>
+      <w:pPr>
+        <w:spacing w:before="160" w:after="160"/>
+        <w:jc w:val="center"/>
+      </w:pPr>
+      <w:r>
+        <w:drawing>
+          <wp:inline xmlns:a="http://schemas.openxmlformats.org/drawingml/2006/main" xmlns:pic="http://schemas.openxmlformats.org/drawingml/2006/picture">
+            <wp:extent cx="5669280" cy="4002417"/>
+            <wp:docPr id="10" name="Picture 10"/>
+            <wp:cNvGraphicFramePr>
+              <a:graphicFrameLocks noChangeAspect="1"/>
+            </wp:cNvGraphicFramePr>
+            <a:graphic>
+              <a:graphicData uri="http://schemas.openxmlformats.org/drawingml/2006/picture">
+                <pic:pic>
+                  <pic:nvPicPr>
+                    <pic:cNvPr id="0" name="certificate.png"/>
+                    <pic:cNvPicPr/>
+                  </pic:nvPicPr>
+                  <pic:blipFill>
+                    <a:blip r:embed="rId15"/>
+                    <a:stretch>
+                      <a:fillRect/>
+                    </a:stretch>
+                  </pic:blipFill>
+                  <pic:spPr>
+                    <a:xfrm>
+                      <a:off x="0" y="0"/>
+                      <a:ext cx="5669280" cy="4002417"/>
+                    </a:xfrm>
+                    <a:prstGeom prst="rect"/>
+                  </pic:spPr>
+                </pic:pic>
+              </a:graphicData>
+            </a:graphic>
+          </wp:inline>
+        </w:drawing>
       </w:r>
     </w:p>
     <w:sectPr>

</xml_diff>

<commit_message>
Replace college logo with latest ANITS Silver Jubilee logo on Cover and Certificate
</commit_message>
<xml_diff>
--- a/IBMQ2DST2470_Internship_Case_Study_Report.docx
+++ b/IBMQ2DST2470_Internship_Case_Study_Report.docx
@@ -79,13 +79,13 @@
     </w:p>
     <w:p>
       <w:pPr>
-        <w:spacing w:before="200" w:after="300"/>
+        <w:spacing w:before="160" w:after="240"/>
         <w:jc w:val="center"/>
       </w:pPr>
       <w:r>
         <w:drawing>
           <wp:inline xmlns:a="http://schemas.openxmlformats.org/drawingml/2006/main" xmlns:pic="http://schemas.openxmlformats.org/drawingml/2006/picture">
-            <wp:extent cx="1554480" cy="1551371"/>
+            <wp:extent cx="1645920" cy="2066682"/>
             <wp:docPr id="1" name="Picture 1"/>
             <wp:cNvGraphicFramePr>
               <a:graphicFrameLocks noChangeAspect="1"/>
@@ -94,7 +94,7 @@
               <a:graphicData uri="http://schemas.openxmlformats.org/drawingml/2006/picture">
                 <pic:pic>
                   <pic:nvPicPr>
-                    <pic:cNvPr id="0" name="anits_logo_colored.png"/>
+                    <pic:cNvPr id="0" name="anits_silver_jubilee_logo.png"/>
                     <pic:cNvPicPr/>
                   </pic:nvPicPr>
                   <pic:blipFill>
@@ -106,7 +106,7 @@
                   <pic:spPr>
                     <a:xfrm>
                       <a:off x="0" y="0"/>
-                      <a:ext cx="1554480" cy="1551371"/>
+                      <a:ext cx="1645920" cy="2066682"/>
                     </a:xfrm>
                     <a:prstGeom prst="rect"/>
                   </pic:spPr>
@@ -119,7 +119,7 @@
     </w:p>
     <w:p>
       <w:pPr>
-        <w:spacing w:before="200" w:after="80"/>
+        <w:spacing w:before="160" w:after="80"/>
         <w:jc w:val="center"/>
       </w:pPr>
       <w:r>
@@ -220,13 +220,13 @@
     </w:p>
     <w:p>
       <w:pPr>
-        <w:spacing w:before="160" w:after="240"/>
+        <w:spacing w:before="120" w:after="200"/>
         <w:jc w:val="center"/>
       </w:pPr>
       <w:r>
         <w:drawing>
           <wp:inline xmlns:a="http://schemas.openxmlformats.org/drawingml/2006/main" xmlns:pic="http://schemas.openxmlformats.org/drawingml/2006/picture">
-            <wp:extent cx="1371600" cy="1368857"/>
+            <wp:extent cx="1234440" cy="1550011"/>
             <wp:docPr id="2" name="Picture 2"/>
             <wp:cNvGraphicFramePr>
               <a:graphicFrameLocks noChangeAspect="1"/>
@@ -235,7 +235,7 @@
               <a:graphicData uri="http://schemas.openxmlformats.org/drawingml/2006/picture">
                 <pic:pic>
                   <pic:nvPicPr>
-                    <pic:cNvPr id="0" name="anits_logo_colored.png"/>
+                    <pic:cNvPr id="0" name="anits_silver_jubilee_logo.png"/>
                     <pic:cNvPicPr/>
                   </pic:nvPicPr>
                   <pic:blipFill>
@@ -247,7 +247,7 @@
                   <pic:spPr>
                     <a:xfrm>
                       <a:off x="0" y="0"/>
-                      <a:ext cx="1371600" cy="1368857"/>
+                      <a:ext cx="1234440" cy="1550011"/>
                     </a:xfrm>
                     <a:prstGeom prst="rect"/>
                   </pic:spPr>
@@ -260,7 +260,7 @@
     </w:p>
     <w:p>
       <w:pPr>
-        <w:spacing w:after="400"/>
+        <w:spacing w:after="320"/>
         <w:jc w:val="center"/>
       </w:pPr>
       <w:r>
@@ -274,7 +274,7 @@
     </w:p>
     <w:p>
       <w:pPr>
-        <w:spacing w:line="312" w:lineRule="auto" w:after="720"/>
+        <w:spacing w:line="312" w:lineRule="auto" w:after="400"/>
       </w:pPr>
       <w:r>
         <w:rPr>
@@ -419,7 +419,7 @@
     </w:tbl>
     <w:p>
       <w:pPr>
-        <w:spacing w:before="800" w:line="276" w:lineRule="auto"/>
+        <w:spacing w:before="400" w:line="276" w:lineRule="auto"/>
         <w:jc w:val="center"/>
       </w:pPr>
       <w:r>

</xml_diff>

<commit_message>
Add formal page box borders across all pages of internship report
</commit_message>
<xml_diff>
--- a/IBMQ2DST2470_Internship_Case_Study_Report.docx
+++ b/IBMQ2DST2470_Internship_Case_Study_Report.docx
@@ -6059,6 +6059,12 @@
       <w:pgMar w:top="1440" w:right="1440" w:bottom="1440" w:left="1440" w:header="720" w:footer="720" w:gutter="0"/>
       <w:cols w:space="720"/>
       <w:docGrid w:linePitch="360"/>
+      <w:pgBorders w:offsetFrom="page">
+        <w:top w:val="single" w:sz="12" w:space="24" w:color="000000"/>
+        <w:left w:val="single" w:sz="12" w:space="24" w:color="000000"/>
+        <w:bottom w:val="single" w:sz="12" w:space="24" w:color="000000"/>
+        <w:right w:val="single" w:sz="12" w:space="24" w:color="000000"/>
+      </w:pgBorders>
     </w:sectPr>
   </w:body>
 </w:document>

</xml_diff>